<commit_message>
Update C34 courseware to v2.0: four topics, eight HR/recruitment labs
- Restructure into four topics: analyse data, plot charts, create
  dashboards, draw insights and recommendations
- Eight labs, each in its own folder with an instruction PDF including
  sample prompts, README, sample-prompts.txt and a mock-data workbook
- Fictional BrightPath Talent Solutions HR and recruitment datasets,
  generated deterministically so each lab's Test It values are exact
- Concept content refreshed from current Microsoft Support and Learn
  guidance (modes, licensing, Python in Excel, advanced analysis,
  COPILOT function, HR scenarios)
- Superseded v1.0 artifacts moved to courseware/archive (not published)
- Standardised course README

Co-Authored-By: Claude Opus 5.5 <noreply@anthropic.com>
</commit_message>
<xml_diff>
--- a/courseware/LP-Microsoft 365 Copilot for Excel.docx
+++ b/courseware/LP-Microsoft 365 Copilot for Excel.docx
@@ -179,7 +179,7 @@
           <w:color w:val="1F6FEB"/>
           <w:sz w:val="24"/>
         </w:rPr>
-        <w:t>Version 1.0</w:t>
+        <w:t>Version 2.0</w:t>
       </w:r>
     </w:p>
     <w:p>
@@ -341,6 +341,64 @@
           </w:p>
         </w:tc>
       </w:tr>
+      <w:tr>
+        <w:tc>
+          <w:tcPr>
+            <w:tcW w:type="dxa" w:w="2160"/>
+          </w:tcPr>
+          <w:p>
+            <w:r/>
+            <w:r>
+              <w:rPr>
+                <w:sz w:val="19"/>
+              </w:rPr>
+              <w:t>2.0</w:t>
+            </w:r>
+          </w:p>
+        </w:tc>
+        <w:tc>
+          <w:tcPr>
+            <w:tcW w:type="dxa" w:w="2160"/>
+          </w:tcPr>
+          <w:p>
+            <w:r/>
+            <w:r>
+              <w:rPr>
+                <w:sz w:val="19"/>
+              </w:rPr>
+              <w:t>8 October 2026</w:t>
+            </w:r>
+          </w:p>
+        </w:tc>
+        <w:tc>
+          <w:tcPr>
+            <w:tcW w:type="dxa" w:w="2160"/>
+          </w:tcPr>
+          <w:p>
+            <w:r/>
+            <w:r>
+              <w:rPr>
+                <w:sz w:val="19"/>
+              </w:rPr>
+              <w:t>Restructured into four topics (analyse, charts, dashboards, insights and recommendations); eight labs in per-lab folders with HR and recruitment mock data and instruction PDFs with sample prompts; content updated from current Microsoft Support and Microsoft Learn guidance.</w:t>
+            </w:r>
+          </w:p>
+        </w:tc>
+        <w:tc>
+          <w:tcPr>
+            <w:tcW w:type="dxa" w:w="2160"/>
+          </w:tcPr>
+          <w:p>
+            <w:r/>
+            <w:r>
+              <w:rPr>
+                <w:sz w:val="19"/>
+              </w:rPr>
+              <w:t>Assigned Tertiary Infotech Academy Trainer</w:t>
+            </w:r>
+          </w:p>
+        </w:tc>
+      </w:tr>
     </w:tbl>
     <w:p>
       <w:r>
@@ -451,7 +509,7 @@
           <w:color w:val="333333"/>
           <w:sz w:val="21"/>
         </w:rPr>
-        <w:t>Day 1 — Prepare, transform, analyse and verify one Copilot-assisted Excel workflow</w:t>
+        <w:t>Day 1 — Analyse, visualise, dashboard and recommend with Copilot in Excel on HR and recruitment data</w:t>
         <w:tab/>
         <w:t>4</w:t>
       </w:r>
@@ -472,7 +530,7 @@
         </w:rPr>
         <w:t>Lab Reference (aligned to course topics)</w:t>
         <w:tab/>
-        <w:t>5</w:t>
+        <w:t>6</w:t>
       </w:r>
     </w:p>
     <w:p>
@@ -767,7 +825,7 @@
         <w:rPr>
           <w:sz w:val="21"/>
         </w:rPr>
-        <w:t>LO1: Explain how Copilot works in Excel, prepare an analysis-ready Excel table and write bounded prompts for workbook tasks.</w:t>
+        <w:t>LO1: Explain how Copilot in Excel works (modes, requirements and limits) and use it to analyse, highlight, sort, filter and calculate HR and recruitment data with verified formulas.</w:t>
       </w:r>
     </w:p>
     <w:p>
@@ -778,7 +836,7 @@
         <w:rPr>
           <w:sz w:val="21"/>
         </w:rPr>
-        <w:t>LO2: Use Copilot to highlight, sort and filter table data, then generate and verify auditable formula columns.</w:t>
+        <w:t>LO2: Use Copilot to create, refine and verify charts, PivotCharts and Python visuals that answer specific HR and recruitment questions.</w:t>
       </w:r>
     </w:p>
     <w:p>
@@ -789,7 +847,7 @@
         <w:rPr>
           <w:sz w:val="21"/>
         </w:rPr>
-        <w:t>LO3: Clean and enrich a business dataset, create PivotTables and charts, and interpret patterns without overstating the evidence.</w:t>
+        <w:t>LO3: Use Copilot to build an interactive, refreshable HR KPI dashboard with PivotTables, KPI cards, charts and slicers, and check every KPI against its definition.</w:t>
       </w:r>
     </w:p>
     <w:p>
@@ -800,7 +858,7 @@
         <w:rPr>
           <w:sz w:val="21"/>
         </w:rPr>
-        <w:t>LO4: Run advanced analysis with Python-assisted Copilot, reconcile the results and produce a traceable decision summary.</w:t>
+        <w:t>LO4: Use Copilot and Python-based advanced analysis to draw evidence-backed insights and actionable, owned recommendations from workforce and survey data.</w:t>
       </w:r>
     </w:p>
     <w:p>
@@ -871,7 +929,7 @@
         <w:keepNext/>
       </w:pPr>
       <w:r>
-        <w:t>Day 1 — Prepare, transform, analyse and verify one Copilot-assisted Excel workflow</w:t>
+        <w:t>Day 1 — Analyse, visualise, dashboard and recommend with Copilot in Excel on HR and recruitment data</w:t>
       </w:r>
     </w:p>
     <w:tbl>
@@ -997,7 +1055,7 @@
                 <w:b w:val="0"/>
                 <w:sz w:val="19"/>
               </w:rPr>
-              <w:t>Welcome, course introduction, learning outcomes, setup check and safe workbook practices</w:t>
+              <w:t>Welcome, course introduction, learning outcomes, Copilot setup check and the BrightPath scenario</w:t>
             </w:r>
           </w:p>
         </w:tc>
@@ -1019,7 +1077,7 @@
                 <w:b/>
                 <w:sz w:val="19"/>
               </w:rPr>
-              <w:t>9:45–10:35</w:t>
+              <w:t>9:45–10:20</w:t>
             </w:r>
           </w:p>
         </w:tc>
@@ -1036,7 +1094,7 @@
                 <w:b w:val="0"/>
                 <w:sz w:val="19"/>
               </w:rPr>
-              <w:t>50 min</w:t>
+              <w:t>35 min</w:t>
             </w:r>
           </w:p>
         </w:tc>
@@ -1053,7 +1111,7 @@
                 <w:b/>
                 <w:sz w:val="19"/>
               </w:rPr>
-              <w:t>Topic 1 - Copilot modes, analysis-ready Excel tables and the G-C-D-C-O-R prompt method</w:t>
+              <w:t>Topic 1 - Use Copilot to Analyse Data: modes, requirements, HR tables, prompting, direct answers and formulas</w:t>
             </w:r>
           </w:p>
         </w:tc>
@@ -1074,7 +1132,7 @@
                 <w:b w:val="0"/>
                 <w:sz w:val="19"/>
               </w:rPr>
-              <w:t>10:35–11:20</w:t>
+              <w:t>10:20–10:55</w:t>
             </w:r>
           </w:p>
         </w:tc>
@@ -1090,7 +1148,7 @@
                 <w:b w:val="0"/>
                 <w:sz w:val="19"/>
               </w:rPr>
-              <w:t>45 min</w:t>
+              <w:t>35 min</w:t>
             </w:r>
           </w:p>
         </w:tc>
@@ -1106,7 +1164,7 @@
                 <w:b w:val="0"/>
                 <w:sz w:val="19"/>
               </w:rPr>
-              <w:t>Hands-on: Lab 1: Prepare the Workbook and Create the Copilot Control Trail</w:t>
+              <w:t>Hands-on: Lab 1: Explore and Question Recruitment Pipeline Data</w:t>
             </w:r>
           </w:p>
         </w:tc>
@@ -1128,7 +1186,7 @@
                 <w:b w:val="0"/>
                 <w:sz w:val="19"/>
               </w:rPr>
-              <w:t>11:20–11:35</w:t>
+              <w:t>10:55–11:10</w:t>
             </w:r>
           </w:p>
         </w:tc>
@@ -1183,7 +1241,7 @@
                 <w:b w:val="0"/>
                 <w:sz w:val="19"/>
               </w:rPr>
-              <w:t>11:35–12:15</w:t>
+              <w:t>11:10–11:45</w:t>
             </w:r>
           </w:p>
         </w:tc>
@@ -1199,7 +1257,7 @@
                 <w:b w:val="0"/>
                 <w:sz w:val="19"/>
               </w:rPr>
-              <w:t>40 min</w:t>
+              <w:t>35 min</w:t>
             </w:r>
           </w:p>
         </w:tc>
@@ -1215,7 +1273,63 @@
                 <w:b w:val="0"/>
                 <w:sz w:val="19"/>
               </w:rPr>
-              <w:t>Hands-on: Lab 2: Apply Reproducible Highlights, Sorts and Filters</w:t>
+              <w:t>Hands-on: Lab 2: Generate and Verify Formula Columns and Lookups for Job Requisitions</w:t>
+            </w:r>
+          </w:p>
+        </w:tc>
+      </w:tr>
+      <w:tr>
+        <w:trPr>
+          <w:cantSplit/>
+        </w:trPr>
+        <w:tc>
+          <w:tcPr>
+            <w:tcW w:type="dxa" w:w="1656"/>
+            <w:shd w:val="clear" w:color="auto" w:fill="E8F0FE"/>
+          </w:tcPr>
+          <w:p>
+            <w:r/>
+            <w:r>
+              <w:rPr>
+                <w:rFonts w:ascii="Arial" w:hAnsi="Arial"/>
+                <w:b/>
+                <w:sz w:val="19"/>
+              </w:rPr>
+              <w:t>11:45–12:15</w:t>
+            </w:r>
+          </w:p>
+        </w:tc>
+        <w:tc>
+          <w:tcPr>
+            <w:tcW w:type="dxa" w:w="1296"/>
+            <w:shd w:val="clear" w:color="auto" w:fill="E8F0FE"/>
+          </w:tcPr>
+          <w:p>
+            <w:r/>
+            <w:r>
+              <w:rPr>
+                <w:rFonts w:ascii="Arial" w:hAnsi="Arial"/>
+                <w:b w:val="0"/>
+                <w:sz w:val="19"/>
+              </w:rPr>
+              <w:t>30 min</w:t>
+            </w:r>
+          </w:p>
+        </w:tc>
+        <w:tc>
+          <w:tcPr>
+            <w:tcW w:type="dxa" w:w="6840"/>
+            <w:shd w:val="clear" w:color="auto" w:fill="E8F0FE"/>
+          </w:tcPr>
+          <w:p>
+            <w:r/>
+            <w:r>
+              <w:rPr>
+                <w:rFonts w:ascii="Arial" w:hAnsi="Arial"/>
+                <w:b/>
+                <w:sz w:val="19"/>
+              </w:rPr>
+              <w:t>Topic 2 - Use Copilot to Plot Charts: chart choice, charts and PivotTables from prompts, refinement, Python visuals</w:t>
             </w:r>
           </w:p>
         </w:tc>
@@ -1268,7 +1382,7 @@
                 <w:b w:val="0"/>
                 <w:sz w:val="19"/>
               </w:rPr>
-              <w:t>Hands-on: Lab 3: Generate and Reconcile Formula Columns</w:t>
+              <w:t>Hands-on: Lab 3: Create and Refine Recruitment Charts with Copilot</w:t>
             </w:r>
           </w:p>
         </w:tc>
@@ -1336,6 +1450,59 @@
         <w:tc>
           <w:tcPr>
             <w:tcW w:type="dxa" w:w="1656"/>
+          </w:tcPr>
+          <w:p>
+            <w:r/>
+            <w:r>
+              <w:rPr>
+                <w:rFonts w:ascii="Arial" w:hAnsi="Arial"/>
+                <w:b w:val="0"/>
+                <w:sz w:val="19"/>
+              </w:rPr>
+              <w:t>14:00–14:35</w:t>
+            </w:r>
+          </w:p>
+        </w:tc>
+        <w:tc>
+          <w:tcPr>
+            <w:tcW w:type="dxa" w:w="1296"/>
+          </w:tcPr>
+          <w:p>
+            <w:r/>
+            <w:r>
+              <w:rPr>
+                <w:rFonts w:ascii="Arial" w:hAnsi="Arial"/>
+                <w:b w:val="0"/>
+                <w:sz w:val="19"/>
+              </w:rPr>
+              <w:t>35 min</w:t>
+            </w:r>
+          </w:p>
+        </w:tc>
+        <w:tc>
+          <w:tcPr>
+            <w:tcW w:type="dxa" w:w="6840"/>
+          </w:tcPr>
+          <w:p>
+            <w:r/>
+            <w:r>
+              <w:rPr>
+                <w:rFonts w:ascii="Arial" w:hAnsi="Arial"/>
+                <w:b w:val="0"/>
+                <w:sz w:val="19"/>
+              </w:rPr>
+              <w:t>Hands-on: Lab 4: Visualise Pay and Placement Distributions with Python in Excel</w:t>
+            </w:r>
+          </w:p>
+        </w:tc>
+      </w:tr>
+      <w:tr>
+        <w:trPr>
+          <w:cantSplit/>
+        </w:trPr>
+        <w:tc>
+          <w:tcPr>
+            <w:tcW w:type="dxa" w:w="1656"/>
             <w:shd w:val="clear" w:color="auto" w:fill="E8F0FE"/>
           </w:tcPr>
           <w:p>
@@ -1346,7 +1513,7 @@
                 <w:b/>
                 <w:sz w:val="19"/>
               </w:rPr>
-              <w:t>14:00–14:55</w:t>
+              <w:t>14:35–15:05</w:t>
             </w:r>
           </w:p>
         </w:tc>
@@ -1363,7 +1530,7 @@
                 <w:b w:val="0"/>
                 <w:sz w:val="19"/>
               </w:rPr>
-              <w:t>55 min</w:t>
+              <w:t>30 min</w:t>
             </w:r>
           </w:p>
         </w:tc>
@@ -1380,7 +1547,7 @@
                 <w:b/>
                 <w:sz w:val="19"/>
               </w:rPr>
-              <w:t>Topic 2 - Data quality, PivotTables, chart design, descriptive insight and Python-assisted analysis</w:t>
+              <w:t>Topic 3 - Use Copilot to Create Dashboards: KPI design, Plan and Edit build, slicers, refresh, responsible sharing</w:t>
             </w:r>
           </w:p>
         </w:tc>
@@ -1401,7 +1568,7 @@
                 <w:b w:val="0"/>
                 <w:sz w:val="19"/>
               </w:rPr>
-              <w:t>14:55–15:55</w:t>
+              <w:t>15:05–15:50</w:t>
             </w:r>
           </w:p>
         </w:tc>
@@ -1417,7 +1584,7 @@
                 <w:b w:val="0"/>
                 <w:sz w:val="19"/>
               </w:rPr>
-              <w:t>60 min</w:t>
+              <w:t>45 min</w:t>
             </w:r>
           </w:p>
         </w:tc>
@@ -1433,7 +1600,7 @@
                 <w:b w:val="0"/>
                 <w:sz w:val="19"/>
               </w:rPr>
-              <w:t>Hands-on: Lab 4: Clean and Enrich the Analysis Table</w:t>
+              <w:t>Hands-on: Lab 5: Build a Recruitment KPI Dashboard with Copilot</w:t>
             </w:r>
           </w:p>
         </w:tc>
@@ -1455,7 +1622,7 @@
                 <w:b w:val="0"/>
                 <w:sz w:val="19"/>
               </w:rPr>
-              <w:t>15:55–16:10</w:t>
+              <w:t>15:50–16:05</w:t>
             </w:r>
           </w:p>
         </w:tc>
@@ -1510,7 +1677,7 @@
                 <w:b w:val="0"/>
                 <w:sz w:val="19"/>
               </w:rPr>
-              <w:t>16:10–17:05</w:t>
+              <w:t>16:05–16:40</w:t>
             </w:r>
           </w:p>
         </w:tc>
@@ -1526,7 +1693,7 @@
                 <w:b w:val="0"/>
                 <w:sz w:val="19"/>
               </w:rPr>
-              <w:t>55 min</w:t>
+              <w:t>35 min</w:t>
             </w:r>
           </w:p>
         </w:tc>
@@ -1542,7 +1709,63 @@
                 <w:b w:val="0"/>
                 <w:sz w:val="19"/>
               </w:rPr>
-              <w:t>Hands-on: Lab 5: Build Reconciled PivotTables and Charts</w:t>
+              <w:t>Hands-on: Lab 6: Build an Interactive Workforce and Attrition Dashboard</w:t>
+            </w:r>
+          </w:p>
+        </w:tc>
+      </w:tr>
+      <w:tr>
+        <w:trPr>
+          <w:cantSplit/>
+        </w:trPr>
+        <w:tc>
+          <w:tcPr>
+            <w:tcW w:type="dxa" w:w="1656"/>
+            <w:shd w:val="clear" w:color="auto" w:fill="E8F0FE"/>
+          </w:tcPr>
+          <w:p>
+            <w:r/>
+            <w:r>
+              <w:rPr>
+                <w:rFonts w:ascii="Arial" w:hAnsi="Arial"/>
+                <w:b/>
+                <w:sz w:val="19"/>
+              </w:rPr>
+              <w:t>16:40–17:10</w:t>
+            </w:r>
+          </w:p>
+        </w:tc>
+        <w:tc>
+          <w:tcPr>
+            <w:tcW w:type="dxa" w:w="1296"/>
+            <w:shd w:val="clear" w:color="auto" w:fill="E8F0FE"/>
+          </w:tcPr>
+          <w:p>
+            <w:r/>
+            <w:r>
+              <w:rPr>
+                <w:rFonts w:ascii="Arial" w:hAnsi="Arial"/>
+                <w:b w:val="0"/>
+                <w:sz w:val="19"/>
+              </w:rPr>
+              <w:t>30 min</w:t>
+            </w:r>
+          </w:p>
+        </w:tc>
+        <w:tc>
+          <w:tcPr>
+            <w:tcW w:type="dxa" w:w="6840"/>
+            <w:shd w:val="clear" w:color="auto" w:fill="E8F0FE"/>
+          </w:tcPr>
+          <w:p>
+            <w:r/>
+            <w:r>
+              <w:rPr>
+                <w:rFonts w:ascii="Arial" w:hAnsi="Arial"/>
+                <w:b/>
+                <w:sz w:val="19"/>
+              </w:rPr>
+              <w:t>Topic 4 - Use Copilot to Draw Insights and Recommendations: trends, advanced analysis, text themes, recommendations</w:t>
             </w:r>
           </w:p>
         </w:tc>
@@ -1563,7 +1786,7 @@
                 <w:b w:val="0"/>
                 <w:sz w:val="19"/>
               </w:rPr>
-              <w:t>17:05–18:20</w:t>
+              <w:t>17:10–17:50</w:t>
             </w:r>
           </w:p>
         </w:tc>
@@ -1579,7 +1802,7 @@
                 <w:b w:val="0"/>
                 <w:sz w:val="19"/>
               </w:rPr>
-              <w:t>75 min</w:t>
+              <w:t>40 min</w:t>
             </w:r>
           </w:p>
         </w:tc>
@@ -1595,7 +1818,60 @@
                 <w:b w:val="0"/>
                 <w:sz w:val="19"/>
               </w:rPr>
-              <w:t>Hands-on: Lab 6: Run Advanced Analysis and Write the Verified Decision Summary</w:t>
+              <w:t>Hands-on: Lab 7: Surface Attrition Insights with Copilot and Advanced Analysis</w:t>
+            </w:r>
+          </w:p>
+        </w:tc>
+      </w:tr>
+      <w:tr>
+        <w:trPr>
+          <w:cantSplit/>
+        </w:trPr>
+        <w:tc>
+          <w:tcPr>
+            <w:tcW w:type="dxa" w:w="1656"/>
+          </w:tcPr>
+          <w:p>
+            <w:r/>
+            <w:r>
+              <w:rPr>
+                <w:rFonts w:ascii="Arial" w:hAnsi="Arial"/>
+                <w:b w:val="0"/>
+                <w:sz w:val="19"/>
+              </w:rPr>
+              <w:t>17:50–18:20</w:t>
+            </w:r>
+          </w:p>
+        </w:tc>
+        <w:tc>
+          <w:tcPr>
+            <w:tcW w:type="dxa" w:w="1296"/>
+          </w:tcPr>
+          <w:p>
+            <w:r/>
+            <w:r>
+              <w:rPr>
+                <w:rFonts w:ascii="Arial" w:hAnsi="Arial"/>
+                <w:b w:val="0"/>
+                <w:sz w:val="19"/>
+              </w:rPr>
+              <w:t>30 min</w:t>
+            </w:r>
+          </w:p>
+        </w:tc>
+        <w:tc>
+          <w:tcPr>
+            <w:tcW w:type="dxa" w:w="6840"/>
+          </w:tcPr>
+          <w:p>
+            <w:r/>
+            <w:r>
+              <w:rPr>
+                <w:rFonts w:ascii="Arial" w:hAnsi="Arial"/>
+                <w:b w:val="0"/>
+                <w:sz w:val="19"/>
+              </w:rPr>
+              <w:t>Hands-on: Lab 8: Turn Engagement Survey Feedback into Recommendations</w:t>
             </w:r>
           </w:p>
         </w:tc>
@@ -1764,7 +2040,7 @@
                 <w:b/>
                 <w:sz w:val="19"/>
               </w:rPr>
-              <w:t>Topic 01: Getting Started with Copilot in Excel</w:t>
+              <w:t>Topic 01: Use Copilot to Analyse Data</w:t>
             </w:r>
           </w:p>
         </w:tc>
@@ -1781,7 +2057,7 @@
                 <w:b w:val="0"/>
                 <w:sz w:val="19"/>
               </w:rPr>
-              <w:t>First half · 3 labs</w:t>
+              <w:t>Labs 1-2</w:t>
             </w:r>
           </w:p>
         </w:tc>
@@ -1797,7 +2073,7 @@
                 <w:b w:val="0"/>
                 <w:sz w:val="19"/>
               </w:rPr>
-              <w:t>Lab 1, Lab 2, Lab 3</w:t>
+              <w:t>Lab 1, Lab 2</w:t>
             </w:r>
           </w:p>
         </w:tc>
@@ -1819,7 +2095,7 @@
                 <w:b/>
                 <w:sz w:val="19"/>
               </w:rPr>
-              <w:t>Topic 02: AI-Powered Data Analysis and Insights</w:t>
+              <w:t>Topic 02: Use Copilot to Plot Charts</w:t>
             </w:r>
           </w:p>
         </w:tc>
@@ -1836,7 +2112,7 @@
                 <w:b w:val="0"/>
                 <w:sz w:val="19"/>
               </w:rPr>
-              <w:t>Second half · 3 labs</w:t>
+              <w:t>Labs 3-4</w:t>
             </w:r>
           </w:p>
         </w:tc>
@@ -1852,7 +2128,117 @@
                 <w:b w:val="0"/>
                 <w:sz w:val="19"/>
               </w:rPr>
-              <w:t>Lab 4, Lab 5, Lab 6</w:t>
+              <w:t>Lab 3, Lab 4</w:t>
+            </w:r>
+          </w:p>
+        </w:tc>
+      </w:tr>
+      <w:tr>
+        <w:trPr>
+          <w:cantSplit/>
+        </w:trPr>
+        <w:tc>
+          <w:tcPr>
+            <w:tcW w:type="dxa" w:w="2880"/>
+            <w:shd w:val="clear" w:color="auto" w:fill="E8F0FE"/>
+          </w:tcPr>
+          <w:p>
+            <w:r/>
+            <w:r>
+              <w:rPr>
+                <w:rFonts w:ascii="Arial" w:hAnsi="Arial"/>
+                <w:b/>
+                <w:sz w:val="19"/>
+              </w:rPr>
+              <w:t>Topic 03: Use Copilot to Create Dashboards</w:t>
+            </w:r>
+          </w:p>
+        </w:tc>
+        <w:tc>
+          <w:tcPr>
+            <w:tcW w:type="dxa" w:w="2880"/>
+            <w:shd w:val="clear" w:color="auto" w:fill="E8F0FE"/>
+          </w:tcPr>
+          <w:p>
+            <w:r/>
+            <w:r>
+              <w:rPr>
+                <w:rFonts w:ascii="Arial" w:hAnsi="Arial"/>
+                <w:b w:val="0"/>
+                <w:sz w:val="19"/>
+              </w:rPr>
+              <w:t>Labs 5-6</w:t>
+            </w:r>
+          </w:p>
+        </w:tc>
+        <w:tc>
+          <w:tcPr>
+            <w:tcW w:type="dxa" w:w="2880"/>
+          </w:tcPr>
+          <w:p>
+            <w:r/>
+            <w:r>
+              <w:rPr>
+                <w:rFonts w:ascii="Arial" w:hAnsi="Arial"/>
+                <w:b w:val="0"/>
+                <w:sz w:val="19"/>
+              </w:rPr>
+              <w:t>Lab 5, Lab 6</w:t>
+            </w:r>
+          </w:p>
+        </w:tc>
+      </w:tr>
+      <w:tr>
+        <w:trPr>
+          <w:cantSplit/>
+        </w:trPr>
+        <w:tc>
+          <w:tcPr>
+            <w:tcW w:type="dxa" w:w="2880"/>
+            <w:shd w:val="clear" w:color="auto" w:fill="E8F0FE"/>
+          </w:tcPr>
+          <w:p>
+            <w:r/>
+            <w:r>
+              <w:rPr>
+                <w:rFonts w:ascii="Arial" w:hAnsi="Arial"/>
+                <w:b/>
+                <w:sz w:val="19"/>
+              </w:rPr>
+              <w:t>Topic 04: Use Copilot to Draw Insights and Recommendations</w:t>
+            </w:r>
+          </w:p>
+        </w:tc>
+        <w:tc>
+          <w:tcPr>
+            <w:tcW w:type="dxa" w:w="2880"/>
+            <w:shd w:val="clear" w:color="auto" w:fill="E8F0FE"/>
+          </w:tcPr>
+          <w:p>
+            <w:r/>
+            <w:r>
+              <w:rPr>
+                <w:rFonts w:ascii="Arial" w:hAnsi="Arial"/>
+                <w:b w:val="0"/>
+                <w:sz w:val="19"/>
+              </w:rPr>
+              <w:t>Labs 7-8</w:t>
+            </w:r>
+          </w:p>
+        </w:tc>
+        <w:tc>
+          <w:tcPr>
+            <w:tcW w:type="dxa" w:w="2880"/>
+          </w:tcPr>
+          <w:p>
+            <w:r/>
+            <w:r>
+              <w:rPr>
+                <w:rFonts w:ascii="Arial" w:hAnsi="Arial"/>
+                <w:b w:val="0"/>
+                <w:sz w:val="19"/>
+              </w:rPr>
+              <w:t>Lab 7, Lab 8</w:t>
             </w:r>
           </w:p>
         </w:tc>

</xml_diff>

<commit_message>
C34 v3.0: restructured 8 labs; Lab 3 charts built by learner prompts
Course v3.0: eight new labs (data prep, formulas & XLOOKUP, PivotTables &
PivotCharts, workbook rules, built-in skills, custom calendar skill,
interactive dashboard, dashboard skill refresh & share), v3.0 deck, LG and
LP rebuilt, prompts page regenerated. Old v2 lab folders and the v2 deck are
removed from the repo (kept locally in courseware/archive/).

Lab 3: dropped the "type these four questions into Charts!A1:A4" prompt.
The Charts sheet starts empty; each chart prompt creates its chart on the
Charts sheet at a set range (A1:H18, J1:Q18, A20:H37, J20:Q37) in a clean
style. The funnel table moves to a new Funnel_2026 sheet. Added
troubleshooting for misplaced charts and glow borders.

Co-Authored-By: Claude Opus 5.5 <noreply@anthropic.com>
</commit_message>
<xml_diff>
--- a/courseware/LP-Microsoft 365 Copilot for Excel.docx
+++ b/courseware/LP-Microsoft 365 Copilot for Excel.docx
@@ -179,7 +179,7 @@
           <w:color w:val="1F6FEB"/>
           <w:sz w:val="24"/>
         </w:rPr>
-        <w:t>Version 2.0</w:t>
+        <w:t>Version 3.0</w:t>
       </w:r>
     </w:p>
     <w:p>
@@ -205,18 +205,19 @@
         <w:tblStyle w:val="TableGrid"/>
         <w:tblW w:type="auto" w:w="0"/>
         <w:jc w:val="center"/>
+        <w:tblLayout w:type="fixed"/>
         <w:tblLook w:firstColumn="1" w:firstRow="1" w:lastColumn="0" w:lastRow="0" w:noHBand="0" w:noVBand="1" w:val="04A0"/>
       </w:tblPr>
       <w:tblGrid>
-        <w:gridCol w:w="2160"/>
-        <w:gridCol w:w="2160"/>
-        <w:gridCol w:w="2160"/>
-        <w:gridCol w:w="2160"/>
+        <w:gridCol w:w="1152"/>
+        <w:gridCol w:w="1656"/>
+        <w:gridCol w:w="4896"/>
+        <w:gridCol w:w="1656"/>
       </w:tblGrid>
       <w:tr>
         <w:tc>
           <w:tcPr>
-            <w:tcW w:type="dxa" w:w="2160"/>
+            <w:tcW w:type="dxa" w:w="1152"/>
             <w:shd w:val="clear" w:color="auto" w:fill="1F6FEB"/>
           </w:tcPr>
           <w:p>
@@ -233,7 +234,7 @@
         </w:tc>
         <w:tc>
           <w:tcPr>
-            <w:tcW w:type="dxa" w:w="2160"/>
+            <w:tcW w:type="dxa" w:w="1656"/>
             <w:shd w:val="clear" w:color="auto" w:fill="1F6FEB"/>
           </w:tcPr>
           <w:p>
@@ -250,7 +251,7 @@
         </w:tc>
         <w:tc>
           <w:tcPr>
-            <w:tcW w:type="dxa" w:w="2160"/>
+            <w:tcW w:type="dxa" w:w="4896"/>
             <w:shd w:val="clear" w:color="auto" w:fill="1F6FEB"/>
           </w:tcPr>
           <w:p>
@@ -267,7 +268,7 @@
         </w:tc>
         <w:tc>
           <w:tcPr>
-            <w:tcW w:type="dxa" w:w="2160"/>
+            <w:tcW w:type="dxa" w:w="1656"/>
             <w:shd w:val="clear" w:color="auto" w:fill="1F6FEB"/>
           </w:tcPr>
           <w:p>
@@ -286,7 +287,7 @@
       <w:tr>
         <w:tc>
           <w:tcPr>
-            <w:tcW w:type="dxa" w:w="2160"/>
+            <w:tcW w:type="dxa" w:w="1152"/>
           </w:tcPr>
           <w:p>
             <w:r/>
@@ -300,7 +301,7 @@
         </w:tc>
         <w:tc>
           <w:tcPr>
-            <w:tcW w:type="dxa" w:w="2160"/>
+            <w:tcW w:type="dxa" w:w="1656"/>
           </w:tcPr>
           <w:p>
             <w:r/>
@@ -314,7 +315,7 @@
         </w:tc>
         <w:tc>
           <w:tcPr>
-            <w:tcW w:type="dxa" w:w="2160"/>
+            <w:tcW w:type="dxa" w:w="4896"/>
           </w:tcPr>
           <w:p>
             <w:r/>
@@ -328,7 +329,7 @@
         </w:tc>
         <w:tc>
           <w:tcPr>
-            <w:tcW w:type="dxa" w:w="2160"/>
+            <w:tcW w:type="dxa" w:w="1656"/>
           </w:tcPr>
           <w:p>
             <w:r/>
@@ -344,7 +345,7 @@
       <w:tr>
         <w:tc>
           <w:tcPr>
-            <w:tcW w:type="dxa" w:w="2160"/>
+            <w:tcW w:type="dxa" w:w="1152"/>
           </w:tcPr>
           <w:p>
             <w:r/>
@@ -358,7 +359,7 @@
         </w:tc>
         <w:tc>
           <w:tcPr>
-            <w:tcW w:type="dxa" w:w="2160"/>
+            <w:tcW w:type="dxa" w:w="1656"/>
           </w:tcPr>
           <w:p>
             <w:r/>
@@ -372,7 +373,7 @@
         </w:tc>
         <w:tc>
           <w:tcPr>
-            <w:tcW w:type="dxa" w:w="2160"/>
+            <w:tcW w:type="dxa" w:w="4896"/>
           </w:tcPr>
           <w:p>
             <w:r/>
@@ -386,7 +387,123 @@
         </w:tc>
         <w:tc>
           <w:tcPr>
-            <w:tcW w:type="dxa" w:w="2160"/>
+            <w:tcW w:type="dxa" w:w="1656"/>
+          </w:tcPr>
+          <w:p>
+            <w:r/>
+            <w:r>
+              <w:rPr>
+                <w:sz w:val="19"/>
+              </w:rPr>
+              <w:t>Assigned Tertiary Infotech Academy Trainer</w:t>
+            </w:r>
+          </w:p>
+        </w:tc>
+      </w:tr>
+      <w:tr>
+        <w:tc>
+          <w:tcPr>
+            <w:tcW w:type="dxa" w:w="1152"/>
+          </w:tcPr>
+          <w:p>
+            <w:r/>
+            <w:r>
+              <w:rPr>
+                <w:sz w:val="19"/>
+              </w:rPr>
+              <w:t>2.1</w:t>
+            </w:r>
+          </w:p>
+        </w:tc>
+        <w:tc>
+          <w:tcPr>
+            <w:tcW w:type="dxa" w:w="1656"/>
+          </w:tcPr>
+          <w:p>
+            <w:r/>
+            <w:r>
+              <w:rPr>
+                <w:sz w:val="19"/>
+              </w:rPr>
+              <w:t>11 October 2026</w:t>
+            </w:r>
+          </w:p>
+        </w:tc>
+        <w:tc>
+          <w:tcPr>
+            <w:tcW w:type="dxa" w:w="4896"/>
+          </w:tcPr>
+          <w:p>
+            <w:r/>
+            <w:r>
+              <w:rPr>
+                <w:sz w:val="19"/>
+              </w:rPr>
+              <w:t>Slides made concise and hands-on: plain-language Key Concepts, a concept slide and a 'Try It in Copilot' slide per sub-topic, a tour of the Copilot pane, AutoSave shown as recommended, and a named theme for each lab.</w:t>
+            </w:r>
+          </w:p>
+        </w:tc>
+        <w:tc>
+          <w:tcPr>
+            <w:tcW w:type="dxa" w:w="1656"/>
+          </w:tcPr>
+          <w:p>
+            <w:r/>
+            <w:r>
+              <w:rPr>
+                <w:sz w:val="19"/>
+              </w:rPr>
+              <w:t>Assigned Tertiary Infotech Academy Trainer</w:t>
+            </w:r>
+          </w:p>
+        </w:tc>
+      </w:tr>
+      <w:tr>
+        <w:tc>
+          <w:tcPr>
+            <w:tcW w:type="dxa" w:w="1152"/>
+          </w:tcPr>
+          <w:p>
+            <w:r/>
+            <w:r>
+              <w:rPr>
+                <w:sz w:val="19"/>
+              </w:rPr>
+              <w:t>3.0</w:t>
+            </w:r>
+          </w:p>
+        </w:tc>
+        <w:tc>
+          <w:tcPr>
+            <w:tcW w:type="dxa" w:w="1656"/>
+          </w:tcPr>
+          <w:p>
+            <w:r/>
+            <w:r>
+              <w:rPr>
+                <w:sz w:val="19"/>
+              </w:rPr>
+              <w:t>11 October 2026</w:t>
+            </w:r>
+          </w:p>
+        </w:tc>
+        <w:tc>
+          <w:tcPr>
+            <w:tcW w:type="dxa" w:w="4896"/>
+          </w:tcPr>
+          <w:p>
+            <w:r/>
+            <w:r>
+              <w:rPr>
+                <w:sz w:val="19"/>
+              </w:rPr>
+              <w:t>Overhauled for the September 2026 Copilot in Excel: three topics (Excel Fundamentals with Copilot; Skills and Rules; Interactive Dashboards). Python in Excel and advanced analysis removed. New content and labs on Plan mode, the model picker, data sources, automated cleanup, Personalization, the .Rules sheet, built-in skills (chart-design, theme-design, unit-economics, check-model) and custom SKILL.md skills written with Copilot (interview calendar, workforce dashboard); dashboards rebuilt around rules, skills, slicers and a timeline.</w:t>
+            </w:r>
+          </w:p>
+        </w:tc>
+        <w:tc>
+          <w:tcPr>
+            <w:tcW w:type="dxa" w:w="1656"/>
           </w:tcPr>
           <w:p>
             <w:r/>
@@ -509,7 +626,7 @@
           <w:color w:val="333333"/>
           <w:sz w:val="21"/>
         </w:rPr>
-        <w:t>Day 1 — Analyse, visualise, dashboard and recommend with Copilot in Excel on HR and recruitment data</w:t>
+        <w:t>Day 1 — Excel fundamentals, skills and rules, and interactive dashboards with Copilot in Excel on HR and recruitment data</w:t>
         <w:tab/>
         <w:t>4</w:t>
       </w:r>
@@ -530,7 +647,7 @@
         </w:rPr>
         <w:t>Lab Reference (aligned to course topics)</w:t>
         <w:tab/>
-        <w:t>6</w:t>
+        <w:t>5</w:t>
       </w:r>
     </w:p>
     <w:p>
@@ -551,11 +668,12 @@
       <w:tblPr>
         <w:tblStyle w:val="TableGrid"/>
         <w:tblW w:type="auto" w:w="0"/>
+        <w:tblLayout w:type="fixed"/>
         <w:tblLook w:firstColumn="1" w:firstRow="1" w:lastColumn="0" w:lastRow="0" w:noHBand="0" w:noVBand="1" w:val="04A0"/>
       </w:tblPr>
       <w:tblGrid>
-        <w:gridCol w:w="4320"/>
-        <w:gridCol w:w="4320"/>
+        <w:gridCol w:w="2448"/>
+        <w:gridCol w:w="6912"/>
       </w:tblGrid>
       <w:tr>
         <w:trPr>
@@ -563,7 +681,7 @@
         </w:trPr>
         <w:tc>
           <w:tcPr>
-            <w:tcW w:type="dxa" w:w="4320"/>
+            <w:tcW w:type="dxa" w:w="2448"/>
             <w:shd w:val="clear" w:color="auto" w:fill="E8F0FE"/>
           </w:tcPr>
           <w:p>
@@ -579,7 +697,7 @@
         </w:tc>
         <w:tc>
           <w:tcPr>
-            <w:tcW w:type="dxa" w:w="4320"/>
+            <w:tcW w:type="dxa" w:w="6912"/>
           </w:tcPr>
           <w:p>
             <w:r/>
@@ -598,7 +716,7 @@
         </w:trPr>
         <w:tc>
           <w:tcPr>
-            <w:tcW w:type="dxa" w:w="4320"/>
+            <w:tcW w:type="dxa" w:w="2448"/>
             <w:shd w:val="clear" w:color="auto" w:fill="E8F0FE"/>
           </w:tcPr>
           <w:p>
@@ -614,7 +732,7 @@
         </w:tc>
         <w:tc>
           <w:tcPr>
-            <w:tcW w:type="dxa" w:w="4320"/>
+            <w:tcW w:type="dxa" w:w="6912"/>
           </w:tcPr>
           <w:p>
             <w:r/>
@@ -633,7 +751,7 @@
         </w:trPr>
         <w:tc>
           <w:tcPr>
-            <w:tcW w:type="dxa" w:w="4320"/>
+            <w:tcW w:type="dxa" w:w="2448"/>
             <w:shd w:val="clear" w:color="auto" w:fill="E8F0FE"/>
           </w:tcPr>
           <w:p>
@@ -649,7 +767,7 @@
         </w:tc>
         <w:tc>
           <w:tcPr>
-            <w:tcW w:type="dxa" w:w="4320"/>
+            <w:tcW w:type="dxa" w:w="6912"/>
           </w:tcPr>
           <w:p>
             <w:r/>
@@ -668,7 +786,7 @@
         </w:trPr>
         <w:tc>
           <w:tcPr>
-            <w:tcW w:type="dxa" w:w="4320"/>
+            <w:tcW w:type="dxa" w:w="2448"/>
             <w:shd w:val="clear" w:color="auto" w:fill="E8F0FE"/>
           </w:tcPr>
           <w:p>
@@ -684,7 +802,7 @@
         </w:tc>
         <w:tc>
           <w:tcPr>
-            <w:tcW w:type="dxa" w:w="4320"/>
+            <w:tcW w:type="dxa" w:w="6912"/>
           </w:tcPr>
           <w:p>
             <w:r/>
@@ -703,7 +821,7 @@
         </w:trPr>
         <w:tc>
           <w:tcPr>
-            <w:tcW w:type="dxa" w:w="4320"/>
+            <w:tcW w:type="dxa" w:w="2448"/>
             <w:shd w:val="clear" w:color="auto" w:fill="E8F0FE"/>
           </w:tcPr>
           <w:p>
@@ -719,7 +837,7 @@
         </w:tc>
         <w:tc>
           <w:tcPr>
-            <w:tcW w:type="dxa" w:w="4320"/>
+            <w:tcW w:type="dxa" w:w="6912"/>
           </w:tcPr>
           <w:p>
             <w:r/>
@@ -738,7 +856,7 @@
         </w:trPr>
         <w:tc>
           <w:tcPr>
-            <w:tcW w:type="dxa" w:w="4320"/>
+            <w:tcW w:type="dxa" w:w="2448"/>
             <w:shd w:val="clear" w:color="auto" w:fill="E8F0FE"/>
           </w:tcPr>
           <w:p>
@@ -754,7 +872,7 @@
         </w:tc>
         <w:tc>
           <w:tcPr>
-            <w:tcW w:type="dxa" w:w="4320"/>
+            <w:tcW w:type="dxa" w:w="6912"/>
           </w:tcPr>
           <w:p>
             <w:r/>
@@ -773,7 +891,7 @@
         </w:trPr>
         <w:tc>
           <w:tcPr>
-            <w:tcW w:type="dxa" w:w="4320"/>
+            <w:tcW w:type="dxa" w:w="2448"/>
             <w:shd w:val="clear" w:color="auto" w:fill="E8F0FE"/>
           </w:tcPr>
           <w:p>
@@ -789,7 +907,7 @@
         </w:tc>
         <w:tc>
           <w:tcPr>
-            <w:tcW w:type="dxa" w:w="4320"/>
+            <w:tcW w:type="dxa" w:w="6912"/>
           </w:tcPr>
           <w:p>
             <w:r/>
@@ -825,7 +943,7 @@
         <w:rPr>
           <w:sz w:val="21"/>
         </w:rPr>
-        <w:t>LO1: Explain how Copilot in Excel works (modes, requirements and limits) and use it to analyse, highlight, sort, filter and calculate HR and recruitment data with verified formulas.</w:t>
+        <w:t>LO1: Use Copilot in Excel's Chat only, Plan and Allow editing modes to prepare and clean data, write formulas and XLOOKUPs, and build PivotTables, PivotCharts and charts, verifying every result.</w:t>
       </w:r>
     </w:p>
     <w:p>
@@ -836,7 +954,7 @@
         <w:rPr>
           <w:sz w:val="21"/>
         </w:rPr>
-        <w:t>LO2: Use Copilot to create, refine and verify charts, PivotCharts and Python visuals that answer specific HR and recruitment questions.</w:t>
+        <w:t>LO2: Make Copilot's work consistent and repeatable with personalisation, workbook rules (.Rules), built-in skills and custom skills that you create with Copilot.</w:t>
       </w:r>
     </w:p>
     <w:p>
@@ -847,18 +965,7 @@
         <w:rPr>
           <w:sz w:val="21"/>
         </w:rPr>
-        <w:t>LO3: Use Copilot to build an interactive, refreshable HR KPI dashboard with PivotTables, KPI cards, charts and slicers, and check every KPI against its definition.</w:t>
-      </w:r>
-    </w:p>
-    <w:p>
-      <w:pPr>
-        <w:pStyle w:val="ListBullet"/>
-      </w:pPr>
-      <w:r>
-        <w:rPr>
-          <w:sz w:val="21"/>
-        </w:rPr>
-        <w:t>LO4: Use Copilot and Python-based advanced analysis to draw evidence-backed insights and actionable, owned recommendations from workforce and survey data.</w:t>
+        <w:t>LO3: Combine Copilot, rules and skills to build a highly visual, interactive and refreshable dashboard, and verify and share it responsibly.</w:t>
       </w:r>
     </w:p>
     <w:p>
@@ -929,7 +1036,7 @@
         <w:keepNext/>
       </w:pPr>
       <w:r>
-        <w:t>Day 1 — Analyse, visualise, dashboard and recommend with Copilot in Excel on HR and recruitment data</w:t>
+        <w:t>Day 1 — Excel fundamentals, skills and rules, and interactive dashboards with Copilot in Excel on HR and recruitment data</w:t>
       </w:r>
     </w:p>
     <w:tbl>
@@ -937,12 +1044,13 @@
         <w:tblStyle w:val="TableGrid"/>
         <w:tblW w:type="auto" w:w="0"/>
         <w:jc w:val="center"/>
+        <w:tblLayout w:type="fixed"/>
         <w:tblLook w:firstColumn="1" w:firstRow="1" w:lastColumn="0" w:lastRow="0" w:noHBand="0" w:noVBand="1" w:val="04A0"/>
       </w:tblPr>
       <w:tblGrid>
-        <w:gridCol w:w="2880"/>
-        <w:gridCol w:w="2880"/>
-        <w:gridCol w:w="2880"/>
+        <w:gridCol w:w="1584"/>
+        <w:gridCol w:w="1224"/>
+        <w:gridCol w:w="6552"/>
       </w:tblGrid>
       <w:tr>
         <w:trPr>
@@ -951,7 +1059,7 @@
         </w:trPr>
         <w:tc>
           <w:tcPr>
-            <w:tcW w:type="dxa" w:w="1656"/>
+            <w:tcW w:type="dxa" w:w="1584"/>
             <w:shd w:val="clear" w:color="auto" w:fill="1F6FEB"/>
           </w:tcPr>
           <w:p>
@@ -969,7 +1077,7 @@
         </w:tc>
         <w:tc>
           <w:tcPr>
-            <w:tcW w:type="dxa" w:w="1296"/>
+            <w:tcW w:type="dxa" w:w="1224"/>
             <w:shd w:val="clear" w:color="auto" w:fill="1F6FEB"/>
           </w:tcPr>
           <w:p>
@@ -987,7 +1095,7 @@
         </w:tc>
         <w:tc>
           <w:tcPr>
-            <w:tcW w:type="dxa" w:w="6840"/>
+            <w:tcW w:type="dxa" w:w="6552"/>
             <w:shd w:val="clear" w:color="auto" w:fill="1F6FEB"/>
           </w:tcPr>
           <w:p>
@@ -1010,7 +1118,7 @@
         </w:trPr>
         <w:tc>
           <w:tcPr>
-            <w:tcW w:type="dxa" w:w="1656"/>
+            <w:tcW w:type="dxa" w:w="1584"/>
             <w:shd w:val="clear" w:color="auto" w:fill="F3F5F8"/>
           </w:tcPr>
           <w:p>
@@ -1027,7 +1135,7 @@
         </w:tc>
         <w:tc>
           <w:tcPr>
-            <w:tcW w:type="dxa" w:w="1296"/>
+            <w:tcW w:type="dxa" w:w="1224"/>
             <w:shd w:val="clear" w:color="auto" w:fill="F3F5F8"/>
           </w:tcPr>
           <w:p>
@@ -1044,7 +1152,7 @@
         </w:tc>
         <w:tc>
           <w:tcPr>
-            <w:tcW w:type="dxa" w:w="6840"/>
+            <w:tcW w:type="dxa" w:w="6552"/>
             <w:shd w:val="clear" w:color="auto" w:fill="F3F5F8"/>
           </w:tcPr>
           <w:p>
@@ -1066,7 +1174,7 @@
         </w:trPr>
         <w:tc>
           <w:tcPr>
-            <w:tcW w:type="dxa" w:w="1656"/>
+            <w:tcW w:type="dxa" w:w="1584"/>
             <w:shd w:val="clear" w:color="auto" w:fill="E8F0FE"/>
           </w:tcPr>
           <w:p>
@@ -1077,14 +1185,68 @@
                 <w:b/>
                 <w:sz w:val="19"/>
               </w:rPr>
-              <w:t>9:45–10:20</w:t>
+              <w:t>9:45–10:05</w:t>
             </w:r>
           </w:p>
         </w:tc>
         <w:tc>
           <w:tcPr>
-            <w:tcW w:type="dxa" w:w="1296"/>
+            <w:tcW w:type="dxa" w:w="1224"/>
             <w:shd w:val="clear" w:color="auto" w:fill="E8F0FE"/>
+          </w:tcPr>
+          <w:p>
+            <w:r/>
+            <w:r>
+              <w:rPr>
+                <w:rFonts w:ascii="Arial" w:hAnsi="Arial"/>
+                <w:b w:val="0"/>
+                <w:sz w:val="19"/>
+              </w:rPr>
+              <w:t>20 min</w:t>
+            </w:r>
+          </w:p>
+        </w:tc>
+        <w:tc>
+          <w:tcPr>
+            <w:tcW w:type="dxa" w:w="6552"/>
+            <w:shd w:val="clear" w:color="auto" w:fill="E8F0FE"/>
+          </w:tcPr>
+          <w:p>
+            <w:r/>
+            <w:r>
+              <w:rPr>
+                <w:rFonts w:ascii="Arial" w:hAnsi="Arial"/>
+                <w:b/>
+                <w:sz w:val="19"/>
+              </w:rPr>
+              <w:t>Topic 1 - Excel Fundamentals with Copilot. Concepts for Lab 1: what data prep is, why data quality matters, Chat only, Plan and Allow editing, the Copilot pane and models, cleaning data with Copilot</w:t>
+            </w:r>
+          </w:p>
+        </w:tc>
+      </w:tr>
+      <w:tr>
+        <w:trPr>
+          <w:cantSplit/>
+        </w:trPr>
+        <w:tc>
+          <w:tcPr>
+            <w:tcW w:type="dxa" w:w="1584"/>
+          </w:tcPr>
+          <w:p>
+            <w:r/>
+            <w:r>
+              <w:rPr>
+                <w:rFonts w:ascii="Arial" w:hAnsi="Arial"/>
+                <w:b w:val="0"/>
+                <w:sz w:val="19"/>
+              </w:rPr>
+              <w:t>10:05–10:40</w:t>
+            </w:r>
+          </w:p>
+        </w:tc>
+        <w:tc>
+          <w:tcPr>
+            <w:tcW w:type="dxa" w:w="1224"/>
           </w:tcPr>
           <w:p>
             <w:r/>
@@ -1100,18 +1262,17 @@
         </w:tc>
         <w:tc>
           <w:tcPr>
-            <w:tcW w:type="dxa" w:w="6840"/>
-            <w:shd w:val="clear" w:color="auto" w:fill="E8F0FE"/>
+            <w:tcW w:type="dxa" w:w="6552"/>
           </w:tcPr>
           <w:p>
             <w:r/>
             <w:r>
               <w:rPr>
                 <w:rFonts w:ascii="Arial" w:hAnsi="Arial"/>
-                <w:b/>
+                <w:b w:val="0"/>
                 <w:sz w:val="19"/>
               </w:rPr>
-              <w:t>Topic 1 - Use Copilot to Analyse Data: modes, requirements, HR tables, prompting, direct answers and formulas</w:t>
+              <w:t>Hands-on: Lab 1 (Data Prep &amp; Data Quality): Explore and Question Recruitment Pipeline Data</w:t>
             </w:r>
           </w:p>
         </w:tc>
@@ -1122,60 +1283,7 @@
         </w:trPr>
         <w:tc>
           <w:tcPr>
-            <w:tcW w:type="dxa" w:w="1656"/>
-          </w:tcPr>
-          <w:p>
-            <w:r/>
-            <w:r>
-              <w:rPr>
-                <w:rFonts w:ascii="Arial" w:hAnsi="Arial"/>
-                <w:b w:val="0"/>
-                <w:sz w:val="19"/>
-              </w:rPr>
-              <w:t>10:20–10:55</w:t>
-            </w:r>
-          </w:p>
-        </w:tc>
-        <w:tc>
-          <w:tcPr>
-            <w:tcW w:type="dxa" w:w="1296"/>
-          </w:tcPr>
-          <w:p>
-            <w:r/>
-            <w:r>
-              <w:rPr>
-                <w:rFonts w:ascii="Arial" w:hAnsi="Arial"/>
-                <w:b w:val="0"/>
-                <w:sz w:val="19"/>
-              </w:rPr>
-              <w:t>35 min</w:t>
-            </w:r>
-          </w:p>
-        </w:tc>
-        <w:tc>
-          <w:tcPr>
-            <w:tcW w:type="dxa" w:w="6840"/>
-          </w:tcPr>
-          <w:p>
-            <w:r/>
-            <w:r>
-              <w:rPr>
-                <w:rFonts w:ascii="Arial" w:hAnsi="Arial"/>
-                <w:b w:val="0"/>
-                <w:sz w:val="19"/>
-              </w:rPr>
-              <w:t>Hands-on: Lab 1: Explore and Question Recruitment Pipeline Data</w:t>
-            </w:r>
-          </w:p>
-        </w:tc>
-      </w:tr>
-      <w:tr>
-        <w:trPr>
-          <w:cantSplit/>
-        </w:trPr>
-        <w:tc>
-          <w:tcPr>
-            <w:tcW w:type="dxa" w:w="1656"/>
+            <w:tcW w:type="dxa" w:w="1584"/>
             <w:shd w:val="clear" w:color="auto" w:fill="FFF4E5"/>
           </w:tcPr>
           <w:p>
@@ -1186,13 +1294,13 @@
                 <w:b w:val="0"/>
                 <w:sz w:val="19"/>
               </w:rPr>
-              <w:t>10:55–11:10</w:t>
+              <w:t>10:40–10:55</w:t>
             </w:r>
           </w:p>
         </w:tc>
         <w:tc>
           <w:tcPr>
-            <w:tcW w:type="dxa" w:w="1296"/>
+            <w:tcW w:type="dxa" w:w="1224"/>
             <w:shd w:val="clear" w:color="auto" w:fill="FFF4E5"/>
           </w:tcPr>
           <w:p>
@@ -1209,7 +1317,7 @@
         </w:tc>
         <w:tc>
           <w:tcPr>
-            <w:tcW w:type="dxa" w:w="6840"/>
+            <w:tcW w:type="dxa" w:w="6552"/>
             <w:shd w:val="clear" w:color="auto" w:fill="FFF4E5"/>
           </w:tcPr>
           <w:p>
@@ -1231,7 +1339,25 @@
         </w:trPr>
         <w:tc>
           <w:tcPr>
-            <w:tcW w:type="dxa" w:w="1656"/>
+            <w:tcW w:type="dxa" w:w="1584"/>
+            <w:shd w:val="clear" w:color="auto" w:fill="E8F0FE"/>
+          </w:tcPr>
+          <w:p>
+            <w:r/>
+            <w:r>
+              <w:rPr>
+                <w:rFonts w:ascii="Arial" w:hAnsi="Arial"/>
+                <w:b/>
+                <w:sz w:val="19"/>
+              </w:rPr>
+              <w:t>10:55–11:05</w:t>
+            </w:r>
+          </w:p>
+        </w:tc>
+        <w:tc>
+          <w:tcPr>
+            <w:tcW w:type="dxa" w:w="1224"/>
+            <w:shd w:val="clear" w:color="auto" w:fill="E8F0FE"/>
           </w:tcPr>
           <w:p>
             <w:r/>
@@ -1241,13 +1367,51 @@
                 <w:b w:val="0"/>
                 <w:sz w:val="19"/>
               </w:rPr>
-              <w:t>11:10–11:45</w:t>
+              <w:t>10 min</w:t>
             </w:r>
           </w:p>
         </w:tc>
         <w:tc>
           <w:tcPr>
-            <w:tcW w:type="dxa" w:w="1296"/>
+            <w:tcW w:type="dxa" w:w="6552"/>
+            <w:shd w:val="clear" w:color="auto" w:fill="E8F0FE"/>
+          </w:tcPr>
+          <w:p>
+            <w:r/>
+            <w:r>
+              <w:rPr>
+                <w:rFonts w:ascii="Arial" w:hAnsi="Arial"/>
+                <w:b/>
+                <w:sz w:val="19"/>
+              </w:rPr>
+              <w:t>Topic 1 - Concepts for Lab 2: what a formula is, table references (what @ means), reading !, :, $ and [@[...]], reading an IF/AND formula, what XLOOKUP is and why it is useful, writing formulas and XLOOKUPs with Copilot</w:t>
+            </w:r>
+          </w:p>
+        </w:tc>
+      </w:tr>
+      <w:tr>
+        <w:trPr>
+          <w:cantSplit/>
+        </w:trPr>
+        <w:tc>
+          <w:tcPr>
+            <w:tcW w:type="dxa" w:w="1584"/>
+          </w:tcPr>
+          <w:p>
+            <w:r/>
+            <w:r>
+              <w:rPr>
+                <w:rFonts w:ascii="Arial" w:hAnsi="Arial"/>
+                <w:b w:val="0"/>
+                <w:sz w:val="19"/>
+              </w:rPr>
+              <w:t>11:05–11:40</w:t>
+            </w:r>
+          </w:p>
+        </w:tc>
+        <w:tc>
+          <w:tcPr>
+            <w:tcW w:type="dxa" w:w="1224"/>
           </w:tcPr>
           <w:p>
             <w:r/>
@@ -1263,7 +1427,7 @@
         </w:tc>
         <w:tc>
           <w:tcPr>
-            <w:tcW w:type="dxa" w:w="6840"/>
+            <w:tcW w:type="dxa" w:w="6552"/>
           </w:tcPr>
           <w:p>
             <w:r/>
@@ -1273,7 +1437,7 @@
                 <w:b w:val="0"/>
                 <w:sz w:val="19"/>
               </w:rPr>
-              <w:t>Hands-on: Lab 2: Generate and Verify Formula Columns and Lookups for Job Requisitions</w:t>
+              <w:t>Hands-on: Lab 2 (Formulas &amp; XLOOKUP): Generate and Verify Formula Columns and XLOOKUPs for Job Requisitions</w:t>
             </w:r>
           </w:p>
         </w:tc>
@@ -1284,7 +1448,7 @@
         </w:trPr>
         <w:tc>
           <w:tcPr>
-            <w:tcW w:type="dxa" w:w="1656"/>
+            <w:tcW w:type="dxa" w:w="1584"/>
             <w:shd w:val="clear" w:color="auto" w:fill="E8F0FE"/>
           </w:tcPr>
           <w:p>
@@ -1295,13 +1459,13 @@
                 <w:b/>
                 <w:sz w:val="19"/>
               </w:rPr>
-              <w:t>11:45–12:15</w:t>
+              <w:t>11:40–11:50</w:t>
             </w:r>
           </w:p>
         </w:tc>
         <w:tc>
           <w:tcPr>
-            <w:tcW w:type="dxa" w:w="1296"/>
+            <w:tcW w:type="dxa" w:w="1224"/>
             <w:shd w:val="clear" w:color="auto" w:fill="E8F0FE"/>
           </w:tcPr>
           <w:p>
@@ -1312,13 +1476,13 @@
                 <w:b w:val="0"/>
                 <w:sz w:val="19"/>
               </w:rPr>
-              <w:t>30 min</w:t>
+              <w:t>10 min</w:t>
             </w:r>
           </w:p>
         </w:tc>
         <w:tc>
           <w:tcPr>
-            <w:tcW w:type="dxa" w:w="6840"/>
+            <w:tcW w:type="dxa" w:w="6552"/>
             <w:shd w:val="clear" w:color="auto" w:fill="E8F0FE"/>
           </w:tcPr>
           <w:p>
@@ -1329,7 +1493,7 @@
                 <w:b/>
                 <w:sz w:val="19"/>
               </w:rPr>
-              <w:t>Topic 2 - Use Copilot to Plot Charts: chart choice, charts and PivotTables from prompts, refinement, Python visuals</w:t>
+              <w:t>Topic 1 - Concepts for Lab 3: PivotTables and PivotCharts, building them with Copilot, choosing and refining charts</w:t>
             </w:r>
           </w:p>
         </w:tc>
@@ -1340,7 +1504,7 @@
         </w:trPr>
         <w:tc>
           <w:tcPr>
-            <w:tcW w:type="dxa" w:w="1656"/>
+            <w:tcW w:type="dxa" w:w="1584"/>
           </w:tcPr>
           <w:p>
             <w:r/>
@@ -1350,13 +1514,13 @@
                 <w:b w:val="0"/>
                 <w:sz w:val="19"/>
               </w:rPr>
-              <w:t>12:15–13:00</w:t>
+              <w:t>11:50–12:35</w:t>
             </w:r>
           </w:p>
         </w:tc>
         <w:tc>
           <w:tcPr>
-            <w:tcW w:type="dxa" w:w="1296"/>
+            <w:tcW w:type="dxa" w:w="1224"/>
           </w:tcPr>
           <w:p>
             <w:r/>
@@ -1372,7 +1536,7 @@
         </w:tc>
         <w:tc>
           <w:tcPr>
-            <w:tcW w:type="dxa" w:w="6840"/>
+            <w:tcW w:type="dxa" w:w="6552"/>
           </w:tcPr>
           <w:p>
             <w:r/>
@@ -1382,7 +1546,7 @@
                 <w:b w:val="0"/>
                 <w:sz w:val="19"/>
               </w:rPr>
-              <w:t>Hands-on: Lab 3: Create and Refine Recruitment Charts with Copilot</w:t>
+              <w:t>Hands-on: Lab 3 (PivotTables, PivotCharts &amp; Visuals): Build PivotTables, PivotCharts and Recruitment Charts with Copilot</w:t>
             </w:r>
           </w:p>
         </w:tc>
@@ -1393,7 +1557,7 @@
         </w:trPr>
         <w:tc>
           <w:tcPr>
-            <w:tcW w:type="dxa" w:w="1656"/>
+            <w:tcW w:type="dxa" w:w="1584"/>
             <w:shd w:val="clear" w:color="auto" w:fill="FDE9D9"/>
           </w:tcPr>
           <w:p>
@@ -1404,13 +1568,13 @@
                 <w:b w:val="0"/>
                 <w:sz w:val="19"/>
               </w:rPr>
-              <w:t>13:00–14:00</w:t>
+              <w:t>12:35–13:35</w:t>
             </w:r>
           </w:p>
         </w:tc>
         <w:tc>
           <w:tcPr>
-            <w:tcW w:type="dxa" w:w="1296"/>
+            <w:tcW w:type="dxa" w:w="1224"/>
             <w:shd w:val="clear" w:color="auto" w:fill="FDE9D9"/>
           </w:tcPr>
           <w:p>
@@ -1427,7 +1591,7 @@
         </w:tc>
         <w:tc>
           <w:tcPr>
-            <w:tcW w:type="dxa" w:w="6840"/>
+            <w:tcW w:type="dxa" w:w="6552"/>
             <w:shd w:val="clear" w:color="auto" w:fill="FDE9D9"/>
           </w:tcPr>
           <w:p>
@@ -1449,7 +1613,25 @@
         </w:trPr>
         <w:tc>
           <w:tcPr>
-            <w:tcW w:type="dxa" w:w="1656"/>
+            <w:tcW w:type="dxa" w:w="1584"/>
+            <w:shd w:val="clear" w:color="auto" w:fill="E8F0FE"/>
+          </w:tcPr>
+          <w:p>
+            <w:r/>
+            <w:r>
+              <w:rPr>
+                <w:rFonts w:ascii="Arial" w:hAnsi="Arial"/>
+                <w:b/>
+                <w:sz w:val="19"/>
+              </w:rPr>
+              <w:t>13:35–13:45</w:t>
+            </w:r>
+          </w:p>
+        </w:tc>
+        <w:tc>
+          <w:tcPr>
+            <w:tcW w:type="dxa" w:w="1224"/>
+            <w:shd w:val="clear" w:color="auto" w:fill="E8F0FE"/>
           </w:tcPr>
           <w:p>
             <w:r/>
@@ -1459,39 +1641,24 @@
                 <w:b w:val="0"/>
                 <w:sz w:val="19"/>
               </w:rPr>
-              <w:t>14:00–14:35</w:t>
+              <w:t>10 min</w:t>
             </w:r>
           </w:p>
         </w:tc>
         <w:tc>
           <w:tcPr>
-            <w:tcW w:type="dxa" w:w="1296"/>
+            <w:tcW w:type="dxa" w:w="6552"/>
+            <w:shd w:val="clear" w:color="auto" w:fill="E8F0FE"/>
           </w:tcPr>
           <w:p>
             <w:r/>
             <w:r>
               <w:rPr>
                 <w:rFonts w:ascii="Arial" w:hAnsi="Arial"/>
-                <w:b w:val="0"/>
+                <w:b/>
                 <w:sz w:val="19"/>
               </w:rPr>
-              <w:t>35 min</w:t>
-            </w:r>
-          </w:p>
-        </w:tc>
-        <w:tc>
-          <w:tcPr>
-            <w:tcW w:type="dxa" w:w="6840"/>
-          </w:tcPr>
-          <w:p>
-            <w:r/>
-            <w:r>
-              <w:rPr>
-                <w:rFonts w:ascii="Arial" w:hAnsi="Arial"/>
-                <w:b w:val="0"/>
-                <w:sz w:val="19"/>
-              </w:rPr>
-              <w:t>Hands-on: Lab 4: Visualise Pay and Placement Distributions with Python in Excel</w:t>
+              <w:t>Topic 2 - Skills and Rules. Concepts for Lab 4: personalisation and workbook rules (.Rules)</w:t>
             </w:r>
           </w:p>
         </w:tc>
@@ -1502,7 +1669,60 @@
         </w:trPr>
         <w:tc>
           <w:tcPr>
-            <w:tcW w:type="dxa" w:w="1656"/>
+            <w:tcW w:type="dxa" w:w="1584"/>
+          </w:tcPr>
+          <w:p>
+            <w:r/>
+            <w:r>
+              <w:rPr>
+                <w:rFonts w:ascii="Arial" w:hAnsi="Arial"/>
+                <w:b w:val="0"/>
+                <w:sz w:val="19"/>
+              </w:rPr>
+              <w:t>13:45–14:25</w:t>
+            </w:r>
+          </w:p>
+        </w:tc>
+        <w:tc>
+          <w:tcPr>
+            <w:tcW w:type="dxa" w:w="1224"/>
+          </w:tcPr>
+          <w:p>
+            <w:r/>
+            <w:r>
+              <w:rPr>
+                <w:rFonts w:ascii="Arial" w:hAnsi="Arial"/>
+                <w:b w:val="0"/>
+                <w:sz w:val="19"/>
+              </w:rPr>
+              <w:t>40 min</w:t>
+            </w:r>
+          </w:p>
+        </w:tc>
+        <w:tc>
+          <w:tcPr>
+            <w:tcW w:type="dxa" w:w="6552"/>
+          </w:tcPr>
+          <w:p>
+            <w:r/>
+            <w:r>
+              <w:rPr>
+                <w:rFonts w:ascii="Arial" w:hAnsi="Arial"/>
+                <w:b w:val="0"/>
+                <w:sz w:val="19"/>
+              </w:rPr>
+              <w:t>Hands-on: Lab 4 (Workbook Rules &amp; Personalisation): Clean Messy Client Orders with Cleanup, Personalisation and Rules</w:t>
+            </w:r>
+          </w:p>
+        </w:tc>
+      </w:tr>
+      <w:tr>
+        <w:trPr>
+          <w:cantSplit/>
+        </w:trPr>
+        <w:tc>
+          <w:tcPr>
+            <w:tcW w:type="dxa" w:w="1584"/>
             <w:shd w:val="clear" w:color="auto" w:fill="E8F0FE"/>
           </w:tcPr>
           <w:p>
@@ -1513,13 +1733,13 @@
                 <w:b/>
                 <w:sz w:val="19"/>
               </w:rPr>
-              <w:t>14:35–15:05</w:t>
+              <w:t>14:25–14:35</w:t>
             </w:r>
           </w:p>
         </w:tc>
         <w:tc>
           <w:tcPr>
-            <w:tcW w:type="dxa" w:w="1296"/>
+            <w:tcW w:type="dxa" w:w="1224"/>
             <w:shd w:val="clear" w:color="auto" w:fill="E8F0FE"/>
           </w:tcPr>
           <w:p>
@@ -1530,13 +1750,13 @@
                 <w:b w:val="0"/>
                 <w:sz w:val="19"/>
               </w:rPr>
-              <w:t>30 min</w:t>
+              <w:t>10 min</w:t>
             </w:r>
           </w:p>
         </w:tc>
         <w:tc>
           <w:tcPr>
-            <w:tcW w:type="dxa" w:w="6840"/>
+            <w:tcW w:type="dxa" w:w="6552"/>
             <w:shd w:val="clear" w:color="auto" w:fill="E8F0FE"/>
           </w:tcPr>
           <w:p>
@@ -1547,7 +1767,7 @@
                 <w:b/>
                 <w:sz w:val="19"/>
               </w:rPr>
-              <w:t>Topic 3 - Use Copilot to Create Dashboards: KPI design, Plan and Edit build, slicers, refresh, responsible sharing</w:t>
+              <w:t>Topic 2 - Concepts for Lab 5: CAC, LTV, churn and payback; built-in formatting, visualisation and finance skills</w:t>
             </w:r>
           </w:p>
         </w:tc>
@@ -1558,7 +1778,7 @@
         </w:trPr>
         <w:tc>
           <w:tcPr>
-            <w:tcW w:type="dxa" w:w="1656"/>
+            <w:tcW w:type="dxa" w:w="1584"/>
           </w:tcPr>
           <w:p>
             <w:r/>
@@ -1568,13 +1788,13 @@
                 <w:b w:val="0"/>
                 <w:sz w:val="19"/>
               </w:rPr>
-              <w:t>15:05–15:50</w:t>
+              <w:t>14:35–15:15</w:t>
             </w:r>
           </w:p>
         </w:tc>
         <w:tc>
           <w:tcPr>
-            <w:tcW w:type="dxa" w:w="1296"/>
+            <w:tcW w:type="dxa" w:w="1224"/>
           </w:tcPr>
           <w:p>
             <w:r/>
@@ -1584,13 +1804,13 @@
                 <w:b w:val="0"/>
                 <w:sz w:val="19"/>
               </w:rPr>
-              <w:t>45 min</w:t>
+              <w:t>40 min</w:t>
             </w:r>
           </w:p>
         </w:tc>
         <w:tc>
           <w:tcPr>
-            <w:tcW w:type="dxa" w:w="6840"/>
+            <w:tcW w:type="dxa" w:w="6552"/>
           </w:tcPr>
           <w:p>
             <w:r/>
@@ -1600,7 +1820,7 @@
                 <w:b w:val="0"/>
                 <w:sz w:val="19"/>
               </w:rPr>
-              <w:t>Hands-on: Lab 5: Build a Recruitment KPI Dashboard with Copilot</w:t>
+              <w:t>Hands-on: Lab 5 (Built-in Skills: Visual &amp; Finance): Analyse HR-Outsourcing Finances with Built-in Skills</w:t>
             </w:r>
           </w:p>
         </w:tc>
@@ -1611,7 +1831,7 @@
         </w:trPr>
         <w:tc>
           <w:tcPr>
-            <w:tcW w:type="dxa" w:w="1656"/>
+            <w:tcW w:type="dxa" w:w="1584"/>
             <w:shd w:val="clear" w:color="auto" w:fill="FFF4E5"/>
           </w:tcPr>
           <w:p>
@@ -1622,13 +1842,13 @@
                 <w:b w:val="0"/>
                 <w:sz w:val="19"/>
               </w:rPr>
-              <w:t>15:50–16:05</w:t>
+              <w:t>15:15–15:30</w:t>
             </w:r>
           </w:p>
         </w:tc>
         <w:tc>
           <w:tcPr>
-            <w:tcW w:type="dxa" w:w="1296"/>
+            <w:tcW w:type="dxa" w:w="1224"/>
             <w:shd w:val="clear" w:color="auto" w:fill="FFF4E5"/>
           </w:tcPr>
           <w:p>
@@ -1645,7 +1865,7 @@
         </w:tc>
         <w:tc>
           <w:tcPr>
-            <w:tcW w:type="dxa" w:w="6840"/>
+            <w:tcW w:type="dxa" w:w="6552"/>
             <w:shd w:val="clear" w:color="auto" w:fill="FFF4E5"/>
           </w:tcPr>
           <w:p>
@@ -1667,7 +1887,25 @@
         </w:trPr>
         <w:tc>
           <w:tcPr>
-            <w:tcW w:type="dxa" w:w="1656"/>
+            <w:tcW w:type="dxa" w:w="1584"/>
+            <w:shd w:val="clear" w:color="auto" w:fill="E8F0FE"/>
+          </w:tcPr>
+          <w:p>
+            <w:r/>
+            <w:r>
+              <w:rPr>
+                <w:rFonts w:ascii="Arial" w:hAnsi="Arial"/>
+                <w:b/>
+                <w:sz w:val="19"/>
+              </w:rPr>
+              <w:t>15:30–15:40</w:t>
+            </w:r>
+          </w:p>
+        </w:tc>
+        <w:tc>
+          <w:tcPr>
+            <w:tcW w:type="dxa" w:w="1224"/>
+            <w:shd w:val="clear" w:color="auto" w:fill="E8F0FE"/>
           </w:tcPr>
           <w:p>
             <w:r/>
@@ -1677,39 +1915,24 @@
                 <w:b w:val="0"/>
                 <w:sz w:val="19"/>
               </w:rPr>
-              <w:t>16:05–16:40</w:t>
+              <w:t>10 min</w:t>
             </w:r>
           </w:p>
         </w:tc>
         <w:tc>
           <w:tcPr>
-            <w:tcW w:type="dxa" w:w="1296"/>
+            <w:tcW w:type="dxa" w:w="6552"/>
+            <w:shd w:val="clear" w:color="auto" w:fill="E8F0FE"/>
           </w:tcPr>
           <w:p>
             <w:r/>
             <w:r>
               <w:rPr>
                 <w:rFonts w:ascii="Arial" w:hAnsi="Arial"/>
-                <w:b w:val="0"/>
+                <w:b/>
                 <w:sz w:val="19"/>
               </w:rPr>
-              <w:t>35 min</w:t>
-            </w:r>
-          </w:p>
-        </w:tc>
-        <w:tc>
-          <w:tcPr>
-            <w:tcW w:type="dxa" w:w="6840"/>
-          </w:tcPr>
-          <w:p>
-            <w:r/>
-            <w:r>
-              <w:rPr>
-                <w:rFonts w:ascii="Arial" w:hAnsi="Arial"/>
-                <w:b w:val="0"/>
-                <w:sz w:val="19"/>
-              </w:rPr>
-              <w:t>Hands-on: Lab 6: Build an Interactive Workforce and Attrition Dashboard</w:t>
+              <w:t>Topic 2 - Concepts for Lab 6: custom skills (SKILL.md) and using Copilot to write and improve a skill</w:t>
             </w:r>
           </w:p>
         </w:tc>
@@ -1720,7 +1943,60 @@
         </w:trPr>
         <w:tc>
           <w:tcPr>
-            <w:tcW w:type="dxa" w:w="1656"/>
+            <w:tcW w:type="dxa" w:w="1584"/>
+          </w:tcPr>
+          <w:p>
+            <w:r/>
+            <w:r>
+              <w:rPr>
+                <w:rFonts w:ascii="Arial" w:hAnsi="Arial"/>
+                <w:b w:val="0"/>
+                <w:sz w:val="19"/>
+              </w:rPr>
+              <w:t>15:40–16:25</w:t>
+            </w:r>
+          </w:p>
+        </w:tc>
+        <w:tc>
+          <w:tcPr>
+            <w:tcW w:type="dxa" w:w="1224"/>
+          </w:tcPr>
+          <w:p>
+            <w:r/>
+            <w:r>
+              <w:rPr>
+                <w:rFonts w:ascii="Arial" w:hAnsi="Arial"/>
+                <w:b w:val="0"/>
+                <w:sz w:val="19"/>
+              </w:rPr>
+              <w:t>45 min</w:t>
+            </w:r>
+          </w:p>
+        </w:tc>
+        <w:tc>
+          <w:tcPr>
+            <w:tcW w:type="dxa" w:w="6552"/>
+          </w:tcPr>
+          <w:p>
+            <w:r/>
+            <w:r>
+              <w:rPr>
+                <w:rFonts w:ascii="Arial" w:hAnsi="Arial"/>
+                <w:b w:val="0"/>
+                <w:sz w:val="19"/>
+              </w:rPr>
+              <w:t>Hands-on: Lab 6 (Custom Skills: Calendar): Use Copilot to Build a Custom Interview-Calendar Skill</w:t>
+            </w:r>
+          </w:p>
+        </w:tc>
+      </w:tr>
+      <w:tr>
+        <w:trPr>
+          <w:cantSplit/>
+        </w:trPr>
+        <w:tc>
+          <w:tcPr>
+            <w:tcW w:type="dxa" w:w="1584"/>
             <w:shd w:val="clear" w:color="auto" w:fill="E8F0FE"/>
           </w:tcPr>
           <w:p>
@@ -1731,13 +2007,13 @@
                 <w:b/>
                 <w:sz w:val="19"/>
               </w:rPr>
-              <w:t>16:40–17:10</w:t>
+              <w:t>16:25–16:35</w:t>
             </w:r>
           </w:p>
         </w:tc>
         <w:tc>
           <w:tcPr>
-            <w:tcW w:type="dxa" w:w="1296"/>
+            <w:tcW w:type="dxa" w:w="1224"/>
             <w:shd w:val="clear" w:color="auto" w:fill="E8F0FE"/>
           </w:tcPr>
           <w:p>
@@ -1748,13 +2024,13 @@
                 <w:b w:val="0"/>
                 <w:sz w:val="19"/>
               </w:rPr>
-              <w:t>30 min</w:t>
+              <w:t>10 min</w:t>
             </w:r>
           </w:p>
         </w:tc>
         <w:tc>
           <w:tcPr>
-            <w:tcW w:type="dxa" w:w="6840"/>
+            <w:tcW w:type="dxa" w:w="6552"/>
             <w:shd w:val="clear" w:color="auto" w:fill="E8F0FE"/>
           </w:tcPr>
           <w:p>
@@ -1765,7 +2041,7 @@
                 <w:b/>
                 <w:sz w:val="19"/>
               </w:rPr>
-              <w:t>Topic 4 - Use Copilot to Draw Insights and Recommendations: trends, advanced analysis, text themes, recommendations</w:t>
+              <w:t>Topic 3 - Interactive Dashboards. Concepts for Lab 7: visual dashboard design, plan and build with rules and skills, slicers, timelines and KPI cards</w:t>
             </w:r>
           </w:p>
         </w:tc>
@@ -1776,7 +2052,7 @@
         </w:trPr>
         <w:tc>
           <w:tcPr>
-            <w:tcW w:type="dxa" w:w="1656"/>
+            <w:tcW w:type="dxa" w:w="1584"/>
           </w:tcPr>
           <w:p>
             <w:r/>
@@ -1786,13 +2062,13 @@
                 <w:b w:val="0"/>
                 <w:sz w:val="19"/>
               </w:rPr>
-              <w:t>17:10–17:50</w:t>
+              <w:t>16:35–17:25</w:t>
             </w:r>
           </w:p>
         </w:tc>
         <w:tc>
           <w:tcPr>
-            <w:tcW w:type="dxa" w:w="1296"/>
+            <w:tcW w:type="dxa" w:w="1224"/>
           </w:tcPr>
           <w:p>
             <w:r/>
@@ -1802,13 +2078,13 @@
                 <w:b w:val="0"/>
                 <w:sz w:val="19"/>
               </w:rPr>
-              <w:t>40 min</w:t>
+              <w:t>50 min</w:t>
             </w:r>
           </w:p>
         </w:tc>
         <w:tc>
           <w:tcPr>
-            <w:tcW w:type="dxa" w:w="6840"/>
+            <w:tcW w:type="dxa" w:w="6552"/>
           </w:tcPr>
           <w:p>
             <w:r/>
@@ -1818,7 +2094,7 @@
                 <w:b w:val="0"/>
                 <w:sz w:val="19"/>
               </w:rPr>
-              <w:t>Hands-on: Lab 7: Surface Attrition Insights with Copilot and Advanced Analysis</w:t>
+              <w:t>Hands-on: Lab 7 (Interactive Dashboard): Build an Interactive Recruitment Dashboard with Rules and Skills</w:t>
             </w:r>
           </w:p>
         </w:tc>
@@ -1829,7 +2105,25 @@
         </w:trPr>
         <w:tc>
           <w:tcPr>
-            <w:tcW w:type="dxa" w:w="1656"/>
+            <w:tcW w:type="dxa" w:w="1584"/>
+            <w:shd w:val="clear" w:color="auto" w:fill="E8F0FE"/>
+          </w:tcPr>
+          <w:p>
+            <w:r/>
+            <w:r>
+              <w:rPr>
+                <w:rFonts w:ascii="Arial" w:hAnsi="Arial"/>
+                <w:b/>
+                <w:sz w:val="19"/>
+              </w:rPr>
+              <w:t>17:25–17:35</w:t>
+            </w:r>
+          </w:p>
+        </w:tc>
+        <w:tc>
+          <w:tcPr>
+            <w:tcW w:type="dxa" w:w="1224"/>
+            <w:shd w:val="clear" w:color="auto" w:fill="E8F0FE"/>
           </w:tcPr>
           <w:p>
             <w:r/>
@@ -1839,39 +2133,24 @@
                 <w:b w:val="0"/>
                 <w:sz w:val="19"/>
               </w:rPr>
-              <w:t>17:50–18:20</w:t>
+              <w:t>10 min</w:t>
             </w:r>
           </w:p>
         </w:tc>
         <w:tc>
           <w:tcPr>
-            <w:tcW w:type="dxa" w:w="1296"/>
+            <w:tcW w:type="dxa" w:w="6552"/>
+            <w:shd w:val="clear" w:color="auto" w:fill="E8F0FE"/>
           </w:tcPr>
           <w:p>
             <w:r/>
             <w:r>
               <w:rPr>
                 <w:rFonts w:ascii="Arial" w:hAnsi="Arial"/>
-                <w:b w:val="0"/>
+                <w:b/>
                 <w:sz w:val="19"/>
               </w:rPr>
-              <w:t>30 min</w:t>
-            </w:r>
-          </w:p>
-        </w:tc>
-        <w:tc>
-          <w:tcPr>
-            <w:tcW w:type="dxa" w:w="6840"/>
-          </w:tcPr>
-          <w:p>
-            <w:r/>
-            <w:r>
-              <w:rPr>
-                <w:rFonts w:ascii="Arial" w:hAnsi="Arial"/>
-                <w:b w:val="0"/>
-                <w:sz w:val="19"/>
-              </w:rPr>
-              <w:t>Hands-on: Lab 8: Turn Engagement Survey Feedback into Recommendations</w:t>
+              <w:t>Topic 3 - Concepts for Lab 8: headcount, attrition and tenure; a reusable dashboard skill and the refresh test; sharing people dashboards responsibly</w:t>
             </w:r>
           </w:p>
         </w:tc>
@@ -1882,7 +2161,60 @@
         </w:trPr>
         <w:tc>
           <w:tcPr>
-            <w:tcW w:type="dxa" w:w="1656"/>
+            <w:tcW w:type="dxa" w:w="1584"/>
+          </w:tcPr>
+          <w:p>
+            <w:r/>
+            <w:r>
+              <w:rPr>
+                <w:rFonts w:ascii="Arial" w:hAnsi="Arial"/>
+                <w:b w:val="0"/>
+                <w:sz w:val="19"/>
+              </w:rPr>
+              <w:t>17:35–18:20</w:t>
+            </w:r>
+          </w:p>
+        </w:tc>
+        <w:tc>
+          <w:tcPr>
+            <w:tcW w:type="dxa" w:w="1224"/>
+          </w:tcPr>
+          <w:p>
+            <w:r/>
+            <w:r>
+              <w:rPr>
+                <w:rFonts w:ascii="Arial" w:hAnsi="Arial"/>
+                <w:b w:val="0"/>
+                <w:sz w:val="19"/>
+              </w:rPr>
+              <w:t>45 min</w:t>
+            </w:r>
+          </w:p>
+        </w:tc>
+        <w:tc>
+          <w:tcPr>
+            <w:tcW w:type="dxa" w:w="6552"/>
+          </w:tcPr>
+          <w:p>
+            <w:r/>
+            <w:r>
+              <w:rPr>
+                <w:rFonts w:ascii="Arial" w:hAnsi="Arial"/>
+                <w:b w:val="0"/>
+                <w:sz w:val="19"/>
+              </w:rPr>
+              <w:t>Hands-on: Lab 8 (Dashboard Skill, Refresh &amp; Share): Turn the Dashboard into a Reusable Skill, Refresh It and Share It Safely</w:t>
+            </w:r>
+          </w:p>
+        </w:tc>
+      </w:tr>
+      <w:tr>
+        <w:trPr>
+          <w:cantSplit/>
+        </w:trPr>
+        <w:tc>
+          <w:tcPr>
+            <w:tcW w:type="dxa" w:w="1584"/>
             <w:shd w:val="clear" w:color="auto" w:fill="F3F5F8"/>
           </w:tcPr>
           <w:p>
@@ -1899,7 +2231,7 @@
         </w:tc>
         <w:tc>
           <w:tcPr>
-            <w:tcW w:type="dxa" w:w="1296"/>
+            <w:tcW w:type="dxa" w:w="1224"/>
             <w:shd w:val="clear" w:color="auto" w:fill="F3F5F8"/>
           </w:tcPr>
           <w:p>
@@ -1916,7 +2248,7 @@
         </w:tc>
         <w:tc>
           <w:tcPr>
-            <w:tcW w:type="dxa" w:w="6840"/>
+            <w:tcW w:type="dxa" w:w="6552"/>
             <w:shd w:val="clear" w:color="auto" w:fill="F3F5F8"/>
           </w:tcPr>
           <w:p>
@@ -1927,7 +2259,7 @@
                 <w:b w:val="0"/>
                 <w:sz w:val="19"/>
               </w:rPr>
-              <w:t>Topic recaps mapped to LO1-LO4, continuing-practice plan and questions</w:t>
+              <w:t>Topic recaps mapped to LO1-LO3, your first skill and rules plan, and questions</w:t>
             </w:r>
           </w:p>
         </w:tc>
@@ -1956,12 +2288,13 @@
       <w:tblPr>
         <w:tblStyle w:val="TableGrid"/>
         <w:tblW w:type="auto" w:w="0"/>
+        <w:tblLayout w:type="fixed"/>
         <w:tblLook w:firstColumn="1" w:firstRow="1" w:lastColumn="0" w:lastRow="0" w:noHBand="0" w:noVBand="1" w:val="04A0"/>
       </w:tblPr>
       <w:tblGrid>
-        <w:gridCol w:w="2880"/>
-        <w:gridCol w:w="2880"/>
-        <w:gridCol w:w="2880"/>
+        <w:gridCol w:w="4896"/>
+        <w:gridCol w:w="1872"/>
+        <w:gridCol w:w="2592"/>
       </w:tblGrid>
       <w:tr>
         <w:trPr>
@@ -1970,7 +2303,7 @@
         </w:trPr>
         <w:tc>
           <w:tcPr>
-            <w:tcW w:type="dxa" w:w="2880"/>
+            <w:tcW w:type="dxa" w:w="4896"/>
             <w:shd w:val="clear" w:color="auto" w:fill="1F6FEB"/>
           </w:tcPr>
           <w:p>
@@ -1988,7 +2321,7 @@
         </w:tc>
         <w:tc>
           <w:tcPr>
-            <w:tcW w:type="dxa" w:w="2880"/>
+            <w:tcW w:type="dxa" w:w="1872"/>
             <w:shd w:val="clear" w:color="auto" w:fill="1F6FEB"/>
           </w:tcPr>
           <w:p>
@@ -2006,7 +2339,7 @@
         </w:tc>
         <w:tc>
           <w:tcPr>
-            <w:tcW w:type="dxa" w:w="2880"/>
+            <w:tcW w:type="dxa" w:w="2592"/>
             <w:shd w:val="clear" w:color="auto" w:fill="1F6FEB"/>
           </w:tcPr>
           <w:p>
@@ -2029,7 +2362,7 @@
         </w:trPr>
         <w:tc>
           <w:tcPr>
-            <w:tcW w:type="dxa" w:w="2880"/>
+            <w:tcW w:type="dxa" w:w="4896"/>
             <w:shd w:val="clear" w:color="auto" w:fill="E8F0FE"/>
           </w:tcPr>
           <w:p>
@@ -2040,13 +2373,13 @@
                 <w:b/>
                 <w:sz w:val="19"/>
               </w:rPr>
-              <w:t>Topic 01: Use Copilot to Analyse Data</w:t>
+              <w:t>Topic 01: Excel Fundamentals with Copilot</w:t>
             </w:r>
           </w:p>
         </w:tc>
         <w:tc>
           <w:tcPr>
-            <w:tcW w:type="dxa" w:w="2880"/>
+            <w:tcW w:type="dxa" w:w="1872"/>
             <w:shd w:val="clear" w:color="auto" w:fill="E8F0FE"/>
           </w:tcPr>
           <w:p>
@@ -2057,13 +2390,13 @@
                 <w:b w:val="0"/>
                 <w:sz w:val="19"/>
               </w:rPr>
-              <w:t>Labs 1-2</w:t>
+              <w:t>Labs 1-3</w:t>
             </w:r>
           </w:p>
         </w:tc>
         <w:tc>
           <w:tcPr>
-            <w:tcW w:type="dxa" w:w="2880"/>
+            <w:tcW w:type="dxa" w:w="2592"/>
           </w:tcPr>
           <w:p>
             <w:r/>
@@ -2073,7 +2406,7 @@
                 <w:b w:val="0"/>
                 <w:sz w:val="19"/>
               </w:rPr>
-              <w:t>Lab 1, Lab 2</w:t>
+              <w:t>Lab 1, Lab 2, Lab 3</w:t>
             </w:r>
           </w:p>
         </w:tc>
@@ -2084,7 +2417,7 @@
         </w:trPr>
         <w:tc>
           <w:tcPr>
-            <w:tcW w:type="dxa" w:w="2880"/>
+            <w:tcW w:type="dxa" w:w="4896"/>
             <w:shd w:val="clear" w:color="auto" w:fill="E8F0FE"/>
           </w:tcPr>
           <w:p>
@@ -2095,13 +2428,13 @@
                 <w:b/>
                 <w:sz w:val="19"/>
               </w:rPr>
-              <w:t>Topic 02: Use Copilot to Plot Charts</w:t>
+              <w:t>Topic 02: Skills and Rules</w:t>
             </w:r>
           </w:p>
         </w:tc>
         <w:tc>
           <w:tcPr>
-            <w:tcW w:type="dxa" w:w="2880"/>
+            <w:tcW w:type="dxa" w:w="1872"/>
             <w:shd w:val="clear" w:color="auto" w:fill="E8F0FE"/>
           </w:tcPr>
           <w:p>
@@ -2112,13 +2445,13 @@
                 <w:b w:val="0"/>
                 <w:sz w:val="19"/>
               </w:rPr>
-              <w:t>Labs 3-4</w:t>
+              <w:t>Labs 4-6</w:t>
             </w:r>
           </w:p>
         </w:tc>
         <w:tc>
           <w:tcPr>
-            <w:tcW w:type="dxa" w:w="2880"/>
+            <w:tcW w:type="dxa" w:w="2592"/>
           </w:tcPr>
           <w:p>
             <w:r/>
@@ -2128,7 +2461,7 @@
                 <w:b w:val="0"/>
                 <w:sz w:val="19"/>
               </w:rPr>
-              <w:t>Lab 3, Lab 4</w:t>
+              <w:t>Lab 4, Lab 5, Lab 6</w:t>
             </w:r>
           </w:p>
         </w:tc>
@@ -2139,7 +2472,7 @@
         </w:trPr>
         <w:tc>
           <w:tcPr>
-            <w:tcW w:type="dxa" w:w="2880"/>
+            <w:tcW w:type="dxa" w:w="4896"/>
             <w:shd w:val="clear" w:color="auto" w:fill="E8F0FE"/>
           </w:tcPr>
           <w:p>
@@ -2150,68 +2483,13 @@
                 <w:b/>
                 <w:sz w:val="19"/>
               </w:rPr>
-              <w:t>Topic 03: Use Copilot to Create Dashboards</w:t>
+              <w:t>Topic 03: Interactive Dashboards with Copilot, Skills and Rules</w:t>
             </w:r>
           </w:p>
         </w:tc>
         <w:tc>
           <w:tcPr>
-            <w:tcW w:type="dxa" w:w="2880"/>
-            <w:shd w:val="clear" w:color="auto" w:fill="E8F0FE"/>
-          </w:tcPr>
-          <w:p>
-            <w:r/>
-            <w:r>
-              <w:rPr>
-                <w:rFonts w:ascii="Arial" w:hAnsi="Arial"/>
-                <w:b w:val="0"/>
-                <w:sz w:val="19"/>
-              </w:rPr>
-              <w:t>Labs 5-6</w:t>
-            </w:r>
-          </w:p>
-        </w:tc>
-        <w:tc>
-          <w:tcPr>
-            <w:tcW w:type="dxa" w:w="2880"/>
-          </w:tcPr>
-          <w:p>
-            <w:r/>
-            <w:r>
-              <w:rPr>
-                <w:rFonts w:ascii="Arial" w:hAnsi="Arial"/>
-                <w:b w:val="0"/>
-                <w:sz w:val="19"/>
-              </w:rPr>
-              <w:t>Lab 5, Lab 6</w:t>
-            </w:r>
-          </w:p>
-        </w:tc>
-      </w:tr>
-      <w:tr>
-        <w:trPr>
-          <w:cantSplit/>
-        </w:trPr>
-        <w:tc>
-          <w:tcPr>
-            <w:tcW w:type="dxa" w:w="2880"/>
-            <w:shd w:val="clear" w:color="auto" w:fill="E8F0FE"/>
-          </w:tcPr>
-          <w:p>
-            <w:r/>
-            <w:r>
-              <w:rPr>
-                <w:rFonts w:ascii="Arial" w:hAnsi="Arial"/>
-                <w:b/>
-                <w:sz w:val="19"/>
-              </w:rPr>
-              <w:t>Topic 04: Use Copilot to Draw Insights and Recommendations</w:t>
-            </w:r>
-          </w:p>
-        </w:tc>
-        <w:tc>
-          <w:tcPr>
-            <w:tcW w:type="dxa" w:w="2880"/>
+            <w:tcW w:type="dxa" w:w="1872"/>
             <w:shd w:val="clear" w:color="auto" w:fill="E8F0FE"/>
           </w:tcPr>
           <w:p>
@@ -2228,7 +2506,7 @@
         </w:tc>
         <w:tc>
           <w:tcPr>
-            <w:tcW w:type="dxa" w:w="2880"/>
+            <w:tcW w:type="dxa" w:w="2592"/>
           </w:tcPr>
           <w:p>
             <w:r/>

</xml_diff>

<commit_message>
Lab 5: built-in visual skills only; Lab 6: custom Pareto-chart skill
- Lab 5 now focuses on @chart-design and @theme-design: four charts on a
  Charts sheet, a Checks sheet and one theme. The finance skills
  (@unit-economics, @check-model), the CAC/LTV content and the
  Headcount_Budget sheet are removed.
- Lab 6 replaces the interview-calendar skill with a pareto-chart skill:
  draft SKILL.md in Copilot on the web, save it, upload it to the OneDrive
  skills folder, install it in Excel and run it on a 500-row job-postings
  workbook (16 job categories, a different colour for every column).
- Deck, Lesson Plan, Learner Guide, prompts page and labs rebuilt from the
  single source; labs renamed to lab-05-built-in-skills-visual-design and
  lab-06-custom-skills-pareto-chart.

Co-Authored-By: Claude Sonnet 5.5 <noreply@anthropic.com>
</commit_message>
<xml_diff>
--- a/courseware/LP-Microsoft 365 Copilot for Excel.docx
+++ b/courseware/LP-Microsoft 365 Copilot for Excel.docx
@@ -323,7 +323,7 @@
               <w:rPr>
                 <w:sz w:val="19"/>
               </w:rPr>
-              <w:t>Lab 8 skill drafting moved to Microsoft 365 Copilot on the web; self-contained creation prompt, web-to-OneDrive-to-Excel handoff, prompt page and learner materials aligned.</w:t>
+              <w:t>Lab 8 skill drafting moved to Microsoft 365 Copilot on the web; self-contained creation prompt, web-to-OneDrive-to-Excel handoff, prompt page and learner materials aligned; Microsoft 365 training-account slide added to the course administration section; Lab 1 simplified to 10 plain-English prompts with no formulas to type (Copilot writes the Checks sheet); Lab 5 now focuses on the built-in @chart-design and @theme-design skills (finance skills removed); Lab 6 builds a custom pareto-chart skill - Copilot web draft, OneDrive upload, install in Excel - on a 500-row job-postings workbook, replacing the interview-calendar skill.</w:t>
             </w:r>
           </w:p>
         </w:tc>
@@ -1825,7 +1825,7 @@
                 <w:b/>
                 <w:sz w:val="19"/>
               </w:rPr>
-              <w:t>Topic 2 - Concepts for Lab 5: CAC, LTV, churn and payback; built-in formatting, visualisation and finance skills</w:t>
+              <w:t>Topic 2 - Concepts for Lab 5: the built-in chart-design and theme-design skills; one theme for the whole workbook</w:t>
             </w:r>
           </w:p>
         </w:tc>
@@ -1878,7 +1878,7 @@
                 <w:b w:val="0"/>
                 <w:sz w:val="19"/>
               </w:rPr>
-              <w:t>Hands-on: Lab 5 (Built-in Skills: Visual &amp; Finance): Analyse HR-Outsourcing Finances with Built-in Skills</w:t>
+              <w:t>Hands-on: Lab 5 (Built-in Skills: Visual Design): Plot and Style Client Growth Charts with Built-in Visual Skills</w:t>
             </w:r>
           </w:p>
         </w:tc>
@@ -1990,7 +1990,7 @@
                 <w:b/>
                 <w:sz w:val="19"/>
               </w:rPr>
-              <w:t>Topic 2 - Concepts for Lab 6: custom skills (SKILL.md) and using Copilot to write and improve a skill</w:t>
+              <w:t>Topic 2 - Concepts for Lab 6: custom skills (SKILL.md), using Copilot to write and improve one, and Pareto charts</w:t>
             </w:r>
           </w:p>
         </w:tc>
@@ -2043,7 +2043,7 @@
                 <w:b w:val="0"/>
                 <w:sz w:val="19"/>
               </w:rPr>
-              <w:t>Hands-on: Lab 6 (Custom Skills: Calendar): Use Copilot to Build a Custom Interview-Calendar Skill</w:t>
+              <w:t>Hands-on: Lab 6 (Custom Skills: Pareto Chart): Use Copilot to Build a Custom Pareto-Chart Skill</w:t>
             </w:r>
           </w:p>
         </w:tc>

</xml_diff>